<commit_message>
Reorder curriculum (Module 7 before Module 4) and reschedule sessions
Client feedback: Shopify MCP, UCP & Agentic Commerce now runs before
End-to-End Shopping Agent, both in the curriculum and the live
calendar. Sessions on 26/27-Aug moved to 25/28-Sep as requested; the
full 20-session calendar was re-flowed to stay chronologically
consistent with the new module order, extending the program end date
from 24-Sep to 28-Sep. Course outline docx regenerated to match.
</commit_message>
<xml_diff>
--- a/assets/downloads/Shopify-Agentic-AI-Developer-Bootcamp-Course-Outline.docx
+++ b/assets/downloads/Shopify-Agentic-AI-Developer-Bootcamp-Course-Outline.docx
@@ -135,7 +135,7 @@
                 <w:color w:val="555555"/>
                 <w:sz w:val="20"/>
               </w:rPr>
-              <w:t>17 Aug 2026 – 24 Sep 2026</w:t>
+              <w:t>17 Aug 2026 – 28 Sep 2026</w:t>
             </w:r>
           </w:p>
         </w:tc>
@@ -1001,154 +1001,6 @@
                 <w:b w:val="0"/>
                 <w:sz w:val="19"/>
               </w:rPr>
-              <w:t>26-Aug-2026</w:t>
-            </w:r>
-          </w:p>
-        </w:tc>
-        <w:tc>
-          <w:tcPr>
-            <w:tcW w:type="dxa" w:w="2550"/>
-            <w:vAlign w:val="center"/>
-            <w:shd w:val="clear" w:color="auto" w:fill="F7F7F7"/>
-          </w:tcPr>
-          <w:p>
-            <w:pPr>
-              <w:jc w:val="center"/>
-            </w:pPr>
-            <w:r/>
-            <w:r>
-              <w:rPr>
-                <w:b w:val="0"/>
-                <w:sz w:val="19"/>
-              </w:rPr>
-              <w:t>Wed</w:t>
-            </w:r>
-          </w:p>
-        </w:tc>
-        <w:tc>
-          <w:tcPr>
-            <w:tcW w:type="dxa" w:w="2550"/>
-            <w:vAlign w:val="center"/>
-            <w:shd w:val="clear" w:color="auto" w:fill="F7F7F7"/>
-          </w:tcPr>
-          <w:p>
-            <w:r/>
-            <w:r>
-              <w:rPr>
-                <w:b w:val="0"/>
-                <w:sz w:val="19"/>
-              </w:rPr>
-              <w:t>M4: End-to-End Shopping Agent</w:t>
-            </w:r>
-          </w:p>
-        </w:tc>
-      </w:tr>
-      <w:tr>
-        <w:tc>
-          <w:tcPr>
-            <w:tcW w:type="dxa" w:w="2550"/>
-            <w:vAlign w:val="center"/>
-          </w:tcPr>
-          <w:p>
-            <w:pPr>
-              <w:jc w:val="center"/>
-            </w:pPr>
-            <w:r/>
-            <w:r>
-              <w:rPr>
-                <w:b w:val="0"/>
-                <w:sz w:val="19"/>
-              </w:rPr>
-              <w:t>9</w:t>
-            </w:r>
-          </w:p>
-        </w:tc>
-        <w:tc>
-          <w:tcPr>
-            <w:tcW w:type="dxa" w:w="2550"/>
-            <w:vAlign w:val="center"/>
-          </w:tcPr>
-          <w:p>
-            <w:r/>
-            <w:r>
-              <w:rPr>
-                <w:b w:val="0"/>
-                <w:sz w:val="19"/>
-              </w:rPr>
-              <w:t>27-Aug-2026</w:t>
-            </w:r>
-          </w:p>
-        </w:tc>
-        <w:tc>
-          <w:tcPr>
-            <w:tcW w:type="dxa" w:w="2550"/>
-            <w:vAlign w:val="center"/>
-          </w:tcPr>
-          <w:p>
-            <w:pPr>
-              <w:jc w:val="center"/>
-            </w:pPr>
-            <w:r/>
-            <w:r>
-              <w:rPr>
-                <w:b w:val="0"/>
-                <w:sz w:val="19"/>
-              </w:rPr>
-              <w:t>Thu</w:t>
-            </w:r>
-          </w:p>
-        </w:tc>
-        <w:tc>
-          <w:tcPr>
-            <w:tcW w:type="dxa" w:w="2550"/>
-            <w:vAlign w:val="center"/>
-          </w:tcPr>
-          <w:p>
-            <w:r/>
-            <w:r>
-              <w:rPr>
-                <w:b w:val="0"/>
-                <w:sz w:val="19"/>
-              </w:rPr>
-              <w:t>M4: End-to-End Shopping Agent</w:t>
-            </w:r>
-          </w:p>
-        </w:tc>
-      </w:tr>
-      <w:tr>
-        <w:tc>
-          <w:tcPr>
-            <w:tcW w:type="dxa" w:w="2550"/>
-            <w:vAlign w:val="center"/>
-            <w:shd w:val="clear" w:color="auto" w:fill="F7F7F7"/>
-          </w:tcPr>
-          <w:p>
-            <w:pPr>
-              <w:jc w:val="center"/>
-            </w:pPr>
-            <w:r/>
-            <w:r>
-              <w:rPr>
-                <w:b w:val="0"/>
-                <w:sz w:val="19"/>
-              </w:rPr>
-              <w:t>10</w:t>
-            </w:r>
-          </w:p>
-        </w:tc>
-        <w:tc>
-          <w:tcPr>
-            <w:tcW w:type="dxa" w:w="2550"/>
-            <w:vAlign w:val="center"/>
-            <w:shd w:val="clear" w:color="auto" w:fill="F7F7F7"/>
-          </w:tcPr>
-          <w:p>
-            <w:r/>
-            <w:r>
-              <w:rPr>
-                <w:b w:val="0"/>
-                <w:sz w:val="19"/>
-              </w:rPr>
               <w:t>28-Aug-2026</w:t>
             </w:r>
           </w:p>
@@ -1186,7 +1038,7 @@
                 <w:b w:val="0"/>
                 <w:sz w:val="19"/>
               </w:rPr>
-              <w:t>M4: End-to-End Shopping Agent</w:t>
+              <w:t>M7: Shopify MCP, UCP &amp; Agentic Commerce</w:t>
             </w:r>
           </w:p>
         </w:tc>
@@ -1207,7 +1059,7 @@
                 <w:b w:val="0"/>
                 <w:sz w:val="19"/>
               </w:rPr>
-              <w:t>11</w:t>
+              <w:t>9</w:t>
             </w:r>
           </w:p>
         </w:tc>
@@ -1258,7 +1110,7 @@
                 <w:b w:val="0"/>
                 <w:sz w:val="19"/>
               </w:rPr>
-              <w:t>M5: Admin-Scoped, Event-Driven &amp; Risk-Aware Agents</w:t>
+              <w:t>M7: Shopify MCP, UCP &amp; Agentic Commerce</w:t>
             </w:r>
           </w:p>
         </w:tc>
@@ -1280,7 +1132,7 @@
                 <w:b w:val="0"/>
                 <w:sz w:val="19"/>
               </w:rPr>
-              <w:t>12</w:t>
+              <w:t>10</w:t>
             </w:r>
           </w:p>
         </w:tc>
@@ -1334,7 +1186,7 @@
                 <w:b w:val="0"/>
                 <w:sz w:val="19"/>
               </w:rPr>
-              <w:t>M5: Admin-Scoped, Event-Driven &amp; Risk-Aware Agents</w:t>
+              <w:t>M7: Shopify MCP, UCP &amp; Agentic Commerce</w:t>
             </w:r>
           </w:p>
         </w:tc>
@@ -1355,7 +1207,7 @@
                 <w:b w:val="0"/>
                 <w:sz w:val="19"/>
               </w:rPr>
-              <w:t>13</w:t>
+              <w:t>11</w:t>
             </w:r>
           </w:p>
         </w:tc>
@@ -1406,7 +1258,7 @@
                 <w:b w:val="0"/>
                 <w:sz w:val="19"/>
               </w:rPr>
-              <w:t>M6: RAG, Personalization &amp; Analytics Agents</w:t>
+              <w:t>M4: End-to-End Shopping Agent</w:t>
             </w:r>
           </w:p>
         </w:tc>
@@ -1428,7 +1280,7 @@
                 <w:b w:val="0"/>
                 <w:sz w:val="19"/>
               </w:rPr>
-              <w:t>14</w:t>
+              <w:t>12</w:t>
             </w:r>
           </w:p>
         </w:tc>
@@ -1482,7 +1334,7 @@
                 <w:b w:val="0"/>
                 <w:sz w:val="19"/>
               </w:rPr>
-              <w:t>M6: RAG, Personalization &amp; Analytics Agents</w:t>
+              <w:t>M4: End-to-End Shopping Agent</w:t>
             </w:r>
           </w:p>
         </w:tc>
@@ -1503,7 +1355,7 @@
                 <w:b w:val="0"/>
                 <w:sz w:val="19"/>
               </w:rPr>
-              <w:t>15</w:t>
+              <w:t>13</w:t>
             </w:r>
           </w:p>
         </w:tc>
@@ -1554,7 +1406,7 @@
                 <w:b w:val="0"/>
                 <w:sz w:val="19"/>
               </w:rPr>
-              <w:t>M7: Shopify MCP, UCP &amp; Agentic Commerce</w:t>
+              <w:t>M4: End-to-End Shopping Agent</w:t>
             </w:r>
           </w:p>
         </w:tc>
@@ -1576,7 +1428,7 @@
                 <w:b w:val="0"/>
                 <w:sz w:val="19"/>
               </w:rPr>
-              <w:t>16</w:t>
+              <w:t>14</w:t>
             </w:r>
           </w:p>
         </w:tc>
@@ -1630,7 +1482,7 @@
                 <w:b w:val="0"/>
                 <w:sz w:val="19"/>
               </w:rPr>
-              <w:t>M7: Shopify MCP, UCP &amp; Agentic Commerce</w:t>
+              <w:t>M5: Admin-Scoped, Event-Driven &amp; Risk-Aware Agents</w:t>
             </w:r>
           </w:p>
         </w:tc>
@@ -1651,7 +1503,7 @@
                 <w:b w:val="0"/>
                 <w:sz w:val="19"/>
               </w:rPr>
-              <w:t>17</w:t>
+              <w:t>15</w:t>
             </w:r>
           </w:p>
         </w:tc>
@@ -1702,7 +1554,7 @@
                 <w:b w:val="0"/>
                 <w:sz w:val="19"/>
               </w:rPr>
-              <w:t>M7: Shopify MCP, UCP &amp; Agentic Commerce</w:t>
+              <w:t>M5: Admin-Scoped, Event-Driven &amp; Risk-Aware Agents</w:t>
             </w:r>
           </w:p>
         </w:tc>
@@ -1724,7 +1576,7 @@
                 <w:b w:val="0"/>
                 <w:sz w:val="19"/>
               </w:rPr>
-              <w:t>18</w:t>
+              <w:t>16</w:t>
             </w:r>
           </w:p>
         </w:tc>
@@ -1778,6 +1630,154 @@
                 <w:b w:val="0"/>
                 <w:sz w:val="19"/>
               </w:rPr>
+              <w:t>M6: RAG, Personalization &amp; Analytics Agents</w:t>
+            </w:r>
+          </w:p>
+        </w:tc>
+      </w:tr>
+      <w:tr>
+        <w:tc>
+          <w:tcPr>
+            <w:tcW w:type="dxa" w:w="2550"/>
+            <w:vAlign w:val="center"/>
+          </w:tcPr>
+          <w:p>
+            <w:pPr>
+              <w:jc w:val="center"/>
+            </w:pPr>
+            <w:r/>
+            <w:r>
+              <w:rPr>
+                <w:b w:val="0"/>
+                <w:sz w:val="19"/>
+              </w:rPr>
+              <w:t>17</w:t>
+            </w:r>
+          </w:p>
+        </w:tc>
+        <w:tc>
+          <w:tcPr>
+            <w:tcW w:type="dxa" w:w="2550"/>
+            <w:vAlign w:val="center"/>
+          </w:tcPr>
+          <w:p>
+            <w:r/>
+            <w:r>
+              <w:rPr>
+                <w:b w:val="0"/>
+                <w:sz w:val="19"/>
+              </w:rPr>
+              <w:t>21-Sep-2026</w:t>
+            </w:r>
+          </w:p>
+        </w:tc>
+        <w:tc>
+          <w:tcPr>
+            <w:tcW w:type="dxa" w:w="2550"/>
+            <w:vAlign w:val="center"/>
+          </w:tcPr>
+          <w:p>
+            <w:pPr>
+              <w:jc w:val="center"/>
+            </w:pPr>
+            <w:r/>
+            <w:r>
+              <w:rPr>
+                <w:b w:val="0"/>
+                <w:sz w:val="19"/>
+              </w:rPr>
+              <w:t>Mon</w:t>
+            </w:r>
+          </w:p>
+        </w:tc>
+        <w:tc>
+          <w:tcPr>
+            <w:tcW w:type="dxa" w:w="2550"/>
+            <w:vAlign w:val="center"/>
+          </w:tcPr>
+          <w:p>
+            <w:r/>
+            <w:r>
+              <w:rPr>
+                <w:b w:val="0"/>
+                <w:sz w:val="19"/>
+              </w:rPr>
+              <w:t>M6: RAG, Personalization &amp; Analytics Agents</w:t>
+            </w:r>
+          </w:p>
+        </w:tc>
+      </w:tr>
+      <w:tr>
+        <w:tc>
+          <w:tcPr>
+            <w:tcW w:type="dxa" w:w="2550"/>
+            <w:vAlign w:val="center"/>
+            <w:shd w:val="clear" w:color="auto" w:fill="F7F7F7"/>
+          </w:tcPr>
+          <w:p>
+            <w:pPr>
+              <w:jc w:val="center"/>
+            </w:pPr>
+            <w:r/>
+            <w:r>
+              <w:rPr>
+                <w:b w:val="0"/>
+                <w:sz w:val="19"/>
+              </w:rPr>
+              <w:t>18</w:t>
+            </w:r>
+          </w:p>
+        </w:tc>
+        <w:tc>
+          <w:tcPr>
+            <w:tcW w:type="dxa" w:w="2550"/>
+            <w:vAlign w:val="center"/>
+            <w:shd w:val="clear" w:color="auto" w:fill="F7F7F7"/>
+          </w:tcPr>
+          <w:p>
+            <w:r/>
+            <w:r>
+              <w:rPr>
+                <w:b w:val="0"/>
+                <w:sz w:val="19"/>
+              </w:rPr>
+              <w:t>24-Sep-2026</w:t>
+            </w:r>
+          </w:p>
+        </w:tc>
+        <w:tc>
+          <w:tcPr>
+            <w:tcW w:type="dxa" w:w="2550"/>
+            <w:vAlign w:val="center"/>
+            <w:shd w:val="clear" w:color="auto" w:fill="F7F7F7"/>
+          </w:tcPr>
+          <w:p>
+            <w:pPr>
+              <w:jc w:val="center"/>
+            </w:pPr>
+            <w:r/>
+            <w:r>
+              <w:rPr>
+                <w:b w:val="0"/>
+                <w:sz w:val="19"/>
+              </w:rPr>
+              <w:t>Thu</w:t>
+            </w:r>
+          </w:p>
+        </w:tc>
+        <w:tc>
+          <w:tcPr>
+            <w:tcW w:type="dxa" w:w="2550"/>
+            <w:vAlign w:val="center"/>
+            <w:shd w:val="clear" w:color="auto" w:fill="F7F7F7"/>
+          </w:tcPr>
+          <w:p>
+            <w:r/>
+            <w:r>
+              <w:rPr>
+                <w:b w:val="0"/>
+                <w:sz w:val="19"/>
+              </w:rPr>
               <w:t>M8: Multi-Agent Orchestration, Safety, Localization &amp; Production</w:t>
             </w:r>
           </w:p>
@@ -1815,7 +1815,7 @@
                 <w:b w:val="0"/>
                 <w:sz w:val="19"/>
               </w:rPr>
-              <w:t>21-Sep-2026</w:t>
+              <w:t>25-Sep-2026</w:t>
             </w:r>
           </w:p>
         </w:tc>
@@ -1834,7 +1834,7 @@
                 <w:b w:val="0"/>
                 <w:sz w:val="19"/>
               </w:rPr>
-              <w:t>Mon</w:t>
+              <w:t>Fri</w:t>
             </w:r>
           </w:p>
         </w:tc>
@@ -1889,7 +1889,7 @@
                 <w:b w:val="0"/>
                 <w:sz w:val="19"/>
               </w:rPr>
-              <w:t>24-Sep-2026</w:t>
+              <w:t>28-Sep-2026</w:t>
             </w:r>
           </w:p>
         </w:tc>
@@ -1909,7 +1909,7 @@
                 <w:b w:val="0"/>
                 <w:sz w:val="19"/>
               </w:rPr>
-              <w:t>Thu</w:t>
+              <w:t>Mon</w:t>
             </w:r>
           </w:p>
         </w:tc>
@@ -2283,6 +2283,110 @@
           <w:color w:val="00843D"/>
           <w:sz w:val="28"/>
         </w:rPr>
+        <w:t>M7 — Shopify MCP, UCP &amp; Agentic Commerce</w:t>
+      </w:r>
+    </w:p>
+    <w:p>
+      <w:pPr>
+        <w:spacing w:after="160"/>
+      </w:pPr>
+      <w:r>
+        <w:rPr>
+          <w:b w:val="0"/>
+          <w:i/>
+          <w:color w:val="555555"/>
+          <w:sz w:val="21"/>
+        </w:rPr>
+        <w:t>Adopt Shopify's native agent protocols and understand the wider agentic-commerce landscape.</w:t>
+      </w:r>
+    </w:p>
+    <w:p>
+      <w:pPr>
+        <w:pStyle w:val="ListBullet"/>
+        <w:spacing w:after="60"/>
+      </w:pPr>
+      <w:r>
+        <w:rPr>
+          <w:sz w:val="20"/>
+        </w:rPr>
+        <w:t>Model Context Protocol (MCP), Explained</w:t>
+      </w:r>
+    </w:p>
+    <w:p>
+      <w:pPr>
+        <w:pStyle w:val="ListBullet"/>
+        <w:spacing w:after="60"/>
+      </w:pPr>
+      <w:r>
+        <w:rPr>
+          <w:sz w:val="20"/>
+        </w:rPr>
+        <w:t>Shopify's Official MCP Servers</w:t>
+      </w:r>
+    </w:p>
+    <w:p>
+      <w:pPr>
+        <w:pStyle w:val="ListBullet"/>
+        <w:spacing w:after="60"/>
+      </w:pPr>
+      <w:r>
+        <w:rPr>
+          <w:sz w:val="20"/>
+        </w:rPr>
+        <w:t>Build a Custom Shopify MCP Server (Node.js)</w:t>
+      </w:r>
+    </w:p>
+    <w:p>
+      <w:pPr>
+        <w:pStyle w:val="ListBullet"/>
+        <w:spacing w:after="60"/>
+      </w:pPr>
+      <w:r>
+        <w:rPr>
+          <w:sz w:val="20"/>
+        </w:rPr>
+        <w:t>Universal Commerce Protocol (UCP)</w:t>
+      </w:r>
+    </w:p>
+    <w:p>
+      <w:pPr>
+        <w:pStyle w:val="ListBullet"/>
+        <w:spacing w:after="60"/>
+      </w:pPr>
+      <w:r>
+        <w:rPr>
+          <w:sz w:val="20"/>
+        </w:rPr>
+        <w:t>Agentic Commerce Protocol (ACP) &amp; the Wider Landscape</w:t>
+      </w:r>
+    </w:p>
+    <w:p>
+      <w:pPr>
+        <w:pStyle w:val="ListBullet"/>
+        <w:spacing w:after="60"/>
+      </w:pPr>
+      <w:r>
+        <w:rPr>
+          <w:sz w:val="20"/>
+        </w:rPr>
+        <w:t>Shopify Sidekick &amp; Agentic Storefronts</w:t>
+      </w:r>
+    </w:p>
+    <w:p>
+      <w:pPr>
+        <w:spacing w:after="120"/>
+      </w:pPr>
+    </w:p>
+    <w:p>
+      <w:pPr>
+        <w:pStyle w:val="Heading2"/>
+        <w:spacing w:before="280" w:after="120"/>
+      </w:pPr>
+      <w:r>
+        <w:rPr>
+          <w:color w:val="00843D"/>
+          <w:sz w:val="28"/>
+        </w:rPr>
         <w:t>M4 — End-to-End Shopping Agent</w:t>
       </w:r>
     </w:p>
@@ -2566,110 +2670,6 @@
           <w:sz w:val="20"/>
         </w:rPr>
         <w:t>Natural-Language Sales Analytics Agent</w:t>
-      </w:r>
-    </w:p>
-    <w:p>
-      <w:pPr>
-        <w:spacing w:after="120"/>
-      </w:pPr>
-    </w:p>
-    <w:p>
-      <w:pPr>
-        <w:pStyle w:val="Heading2"/>
-        <w:spacing w:before="280" w:after="120"/>
-      </w:pPr>
-      <w:r>
-        <w:rPr>
-          <w:color w:val="00843D"/>
-          <w:sz w:val="28"/>
-        </w:rPr>
-        <w:t>M7 — Shopify MCP, UCP &amp; Agentic Commerce</w:t>
-      </w:r>
-    </w:p>
-    <w:p>
-      <w:pPr>
-        <w:spacing w:after="160"/>
-      </w:pPr>
-      <w:r>
-        <w:rPr>
-          <w:b w:val="0"/>
-          <w:i/>
-          <w:color w:val="555555"/>
-          <w:sz w:val="21"/>
-        </w:rPr>
-        <w:t>Adopt Shopify's native agent protocols and understand the wider agentic-commerce landscape.</w:t>
-      </w:r>
-    </w:p>
-    <w:p>
-      <w:pPr>
-        <w:pStyle w:val="ListBullet"/>
-        <w:spacing w:after="60"/>
-      </w:pPr>
-      <w:r>
-        <w:rPr>
-          <w:sz w:val="20"/>
-        </w:rPr>
-        <w:t>Model Context Protocol (MCP), Explained</w:t>
-      </w:r>
-    </w:p>
-    <w:p>
-      <w:pPr>
-        <w:pStyle w:val="ListBullet"/>
-        <w:spacing w:after="60"/>
-      </w:pPr>
-      <w:r>
-        <w:rPr>
-          <w:sz w:val="20"/>
-        </w:rPr>
-        <w:t>Shopify's Official MCP Servers</w:t>
-      </w:r>
-    </w:p>
-    <w:p>
-      <w:pPr>
-        <w:pStyle w:val="ListBullet"/>
-        <w:spacing w:after="60"/>
-      </w:pPr>
-      <w:r>
-        <w:rPr>
-          <w:sz w:val="20"/>
-        </w:rPr>
-        <w:t>Build a Custom Shopify MCP Server (Node.js)</w:t>
-      </w:r>
-    </w:p>
-    <w:p>
-      <w:pPr>
-        <w:pStyle w:val="ListBullet"/>
-        <w:spacing w:after="60"/>
-      </w:pPr>
-      <w:r>
-        <w:rPr>
-          <w:sz w:val="20"/>
-        </w:rPr>
-        <w:t>Universal Commerce Protocol (UCP)</w:t>
-      </w:r>
-    </w:p>
-    <w:p>
-      <w:pPr>
-        <w:pStyle w:val="ListBullet"/>
-        <w:spacing w:after="60"/>
-      </w:pPr>
-      <w:r>
-        <w:rPr>
-          <w:sz w:val="20"/>
-        </w:rPr>
-        <w:t>Agentic Commerce Protocol (ACP) &amp; the Wider Landscape</w:t>
-      </w:r>
-    </w:p>
-    <w:p>
-      <w:pPr>
-        <w:pStyle w:val="ListBullet"/>
-        <w:spacing w:after="60"/>
-      </w:pPr>
-      <w:r>
-        <w:rPr>
-          <w:sz w:val="20"/>
-        </w:rPr>
-        <w:t>Shopify Sidekick &amp; Agentic Storefronts</w:t>
       </w:r>
     </w:p>
     <w:p>

</xml_diff>